<commit_message>
Fix Lab 3 Part A per review: yescrypt fields, captions, missing setup figures
Co-Authored-By: Claude Opus 5.5 <noreply@anthropic.com>
Claude-Session: https://claude.ai/code/session_015FzNpWvVcgtCUNTKwZzDr2
</commit_message>
<xml_diff>
--- a/lab3_report/ITE408_Lab3_Report_1093911.docx
+++ b/lab3_report/ITE408_Lab3_Report_1093911.docx
@@ -535,11 +535,36 @@
         <w:rPr>
           <w:b w:val="0"/>
         </w:rPr>
-        <w:t>My first version used double quotes, and bash turned the \$ into a normal $ when it read the file. Because of this the root prompt ended with $ instead of #, which is misleading in a lab about privileges (# means root). I fixed it by replacing the line in all five .bashrc files with a single-quoted version. After the fix, root shows # and normal users show $.</w:t>
+        <w:t>My first version used double quotes, and bash turned the \$ into a normal $ when it read the file. Because of this the root prompt ended with $ instead of #, which is misleading in a lab about privileges (# means root). I fixed it by replacing the last line of all five .bashrc files with a single-quoted version:</w:t>
       </w:r>
     </w:p>
     <w:p>
       <w:pPr>
+        <w:spacing w:after="160"/>
+        <w:ind w:left="283"/>
+        <w:shd w:val="clear" w:color="auto" w:fill="F2F2F2"/>
+      </w:pPr>
+      <w:r>
+        <w:rPr>
+          <w:rFonts w:ascii="Consolas" w:hAnsi="Consolas" w:eastAsia="Consolas"/>
+          <w:sz w:val="18"/>
+        </w:rPr>
+        <w:t>PS1='\d \@ [1093911] \u:\w\$ '</w:t>
+      </w:r>
+    </w:p>
+    <w:p>
+      <w:pPr>
+        <w:jc w:val="both"/>
+      </w:pPr>
+      <w:r>
+        <w:rPr>
+          <w:b w:val="0"/>
+        </w:rPr>
+        <w:t>The screenshot shows the old line that was removed from each file, and after reloading root's .bashrc the prompt ends with #. Normal users still show $.</w:t>
+      </w:r>
+    </w:p>
+    <w:p>
+      <w:pPr>
         <w:keepNext/>
         <w:spacing w:after="40"/>
         <w:jc w:val="center"/>
@@ -547,7 +572,7 @@
       <w:r>
         <w:drawing>
           <wp:inline xmlns:a="http://schemas.openxmlformats.org/drawingml/2006/main" xmlns:pic="http://schemas.openxmlformats.org/drawingml/2006/picture">
-            <wp:extent cx="5760000" cy="668160"/>
+            <wp:extent cx="5760000" cy="852480"/>
             <wp:docPr id="3" name="Picture 3"/>
             <wp:cNvGraphicFramePr>
               <a:graphicFrameLocks noChangeAspect="1"/>
@@ -568,7 +593,7 @@
                   <pic:spPr>
                     <a:xfrm>
                       <a:off x="0" y="0"/>
-                      <a:ext cx="5760000" cy="668160"/>
+                      <a:ext cx="5760000" cy="852480"/>
                     </a:xfrm>
                     <a:prstGeom prst="rect"/>
                   </pic:spPr>
@@ -604,7 +629,68 @@
         <w:rPr>
           <w:b w:val="0"/>
         </w:rPr>
-        <w:t>I created the group with groupadd DEVELOPERS. Groups are stored in /etc/group, one per line, in the format name:password:GID:members. The x means the group password (if any) is kept in /etc/gshadow.</w:t>
+        <w:t>I created the group with groupadd DEVELOPERS.</w:t>
+      </w:r>
+    </w:p>
+    <w:p>
+      <w:pPr>
+        <w:keepNext/>
+        <w:spacing w:after="40"/>
+        <w:jc w:val="center"/>
+      </w:pPr>
+      <w:r>
+        <w:drawing>
+          <wp:inline xmlns:a="http://schemas.openxmlformats.org/drawingml/2006/main" xmlns:pic="http://schemas.openxmlformats.org/drawingml/2006/picture">
+            <wp:extent cx="5760000" cy="246154"/>
+            <wp:docPr id="4" name="Picture 4"/>
+            <wp:cNvGraphicFramePr>
+              <a:graphicFrameLocks noChangeAspect="1"/>
+            </wp:cNvGraphicFramePr>
+            <a:graphic>
+              <a:graphicData uri="http://schemas.openxmlformats.org/drawingml/2006/picture">
+                <pic:pic>
+                  <pic:nvPicPr>
+                    <pic:cNvPr id="0" name="c36_groupadd.png"/>
+                    <pic:cNvPicPr/>
+                  </pic:nvPicPr>
+                  <pic:blipFill>
+                    <a:blip r:embed="rId14"/>
+                    <a:stretch>
+                      <a:fillRect/>
+                    </a:stretch>
+                  </pic:blipFill>
+                  <pic:spPr>
+                    <a:xfrm>
+                      <a:off x="0" y="0"/>
+                      <a:ext cx="5760000" cy="246154"/>
+                    </a:xfrm>
+                    <a:prstGeom prst="rect"/>
+                  </pic:spPr>
+                </pic:pic>
+              </a:graphicData>
+            </a:graphic>
+          </wp:inline>
+        </w:drawing>
+      </w:r>
+    </w:p>
+    <w:p>
+      <w:pPr>
+        <w:pStyle w:val="Caption"/>
+        <w:jc w:val="center"/>
+      </w:pPr>
+      <w:r>
+        <w:t>Figure 3: Creating the DEVELOPERS group</w:t>
+      </w:r>
+    </w:p>
+    <w:p>
+      <w:pPr>
+        <w:jc w:val="both"/>
+      </w:pPr>
+      <w:r>
+        <w:rPr>
+          <w:b w:val="0"/>
+        </w:rPr>
+        <w:t>Groups are stored in /etc/group, one per line, in the format name:password:GID:members. The x means the group password (if any) is kept in /etc/gshadow.</w:t>
       </w:r>
     </w:p>
     <w:p>
@@ -617,7 +703,7 @@
         <w:drawing>
           <wp:inline xmlns:a="http://schemas.openxmlformats.org/drawingml/2006/main" xmlns:pic="http://schemas.openxmlformats.org/drawingml/2006/picture">
             <wp:extent cx="5760000" cy="1728000"/>
-            <wp:docPr id="4" name="Picture 4"/>
+            <wp:docPr id="5" name="Picture 5"/>
             <wp:cNvGraphicFramePr>
               <a:graphicFrameLocks noChangeAspect="1"/>
             </wp:cNvGraphicFramePr>
@@ -629,7 +715,7 @@
                     <pic:cNvPicPr/>
                   </pic:nvPicPr>
                   <pic:blipFill>
-                    <a:blip r:embed="rId14"/>
+                    <a:blip r:embed="rId15"/>
                     <a:stretch>
                       <a:fillRect/>
                     </a:stretch>
@@ -654,7 +740,7 @@
         <w:jc w:val="center"/>
       </w:pPr>
       <w:r>
-        <w:t>Figure 3: The DEVELOPERS group at the end of /etc/group</w:t>
+        <w:t>Figure 4: The DEVELOPERS group at the end of /etc/group</w:t>
       </w:r>
     </w:p>
     <w:p>
@@ -697,7 +783,7 @@
         <w:drawing>
           <wp:inline xmlns:a="http://schemas.openxmlformats.org/drawingml/2006/main" xmlns:pic="http://schemas.openxmlformats.org/drawingml/2006/picture">
             <wp:extent cx="5760000" cy="2926302"/>
-            <wp:docPr id="5" name="Picture 5"/>
+            <wp:docPr id="6" name="Picture 6"/>
             <wp:cNvGraphicFramePr>
               <a:graphicFrameLocks noChangeAspect="1"/>
             </wp:cNvGraphicFramePr>
@@ -709,7 +795,7 @@
                     <pic:cNvPicPr/>
                   </pic:nvPicPr>
                   <pic:blipFill>
-                    <a:blip r:embed="rId15"/>
+                    <a:blip r:embed="rId16"/>
                     <a:stretch>
                       <a:fillRect/>
                     </a:stretch>
@@ -734,7 +820,7 @@
         <w:jc w:val="center"/>
       </w:pPr>
       <w:r>
-        <w:t>Figure 4: Creating the user sam with adduser</w:t>
+        <w:t>Figure 5: Creating the user sam with adduser</w:t>
       </w:r>
     </w:p>
     <w:p>
@@ -758,7 +844,7 @@
         <w:drawing>
           <wp:inline xmlns:a="http://schemas.openxmlformats.org/drawingml/2006/main" xmlns:pic="http://schemas.openxmlformats.org/drawingml/2006/picture">
             <wp:extent cx="5760000" cy="2491880"/>
-            <wp:docPr id="6" name="Picture 6"/>
+            <wp:docPr id="7" name="Picture 7"/>
             <wp:cNvGraphicFramePr>
               <a:graphicFrameLocks noChangeAspect="1"/>
             </wp:cNvGraphicFramePr>
@@ -770,7 +856,7 @@
                     <pic:cNvPicPr/>
                   </pic:nvPicPr>
                   <pic:blipFill>
-                    <a:blip r:embed="rId16"/>
+                    <a:blip r:embed="rId17"/>
                     <a:stretch>
                       <a:fillRect/>
                     </a:stretch>
@@ -795,7 +881,7 @@
         <w:jc w:val="center"/>
       </w:pPr>
       <w:r>
-        <w:t>Figure 5: Adding sam to DEVELOPERS and creating danny</w:t>
+        <w:t>Figure 6: Adding sam to DEVELOPERS and creating danny</w:t>
       </w:r>
     </w:p>
     <w:p>
@@ -827,7 +913,7 @@
         <w:drawing>
           <wp:inline xmlns:a="http://schemas.openxmlformats.org/drawingml/2006/main" xmlns:pic="http://schemas.openxmlformats.org/drawingml/2006/picture">
             <wp:extent cx="5760000" cy="1042924"/>
-            <wp:docPr id="7" name="Picture 7"/>
+            <wp:docPr id="8" name="Picture 8"/>
             <wp:cNvGraphicFramePr>
               <a:graphicFrameLocks noChangeAspect="1"/>
             </wp:cNvGraphicFramePr>
@@ -839,7 +925,7 @@
                     <pic:cNvPicPr/>
                   </pic:nvPicPr>
                   <pic:blipFill>
-                    <a:blip r:embed="rId17"/>
+                    <a:blip r:embed="rId18"/>
                     <a:stretch>
                       <a:fillRect/>
                     </a:stretch>
@@ -864,7 +950,7 @@
         <w:jc w:val="center"/>
       </w:pPr>
       <w:r>
-        <w:t>Figure 6: The new users at the end of /etc/passwd</w:t>
+        <w:t>Figure 7: The new users at the end of /etc/passwd</w:t>
       </w:r>
     </w:p>
     <w:p>
@@ -888,7 +974,7 @@
         <w:drawing>
           <wp:inline xmlns:a="http://schemas.openxmlformats.org/drawingml/2006/main" xmlns:pic="http://schemas.openxmlformats.org/drawingml/2006/picture">
             <wp:extent cx="5760000" cy="318483"/>
-            <wp:docPr id="8" name="Picture 8"/>
+            <wp:docPr id="9" name="Picture 9"/>
             <wp:cNvGraphicFramePr>
               <a:graphicFrameLocks noChangeAspect="1"/>
             </wp:cNvGraphicFramePr>
@@ -900,7 +986,7 @@
                     <pic:cNvPicPr/>
                   </pic:nvPicPr>
                   <pic:blipFill>
-                    <a:blip r:embed="rId18"/>
+                    <a:blip r:embed="rId19"/>
                     <a:stretch>
                       <a:fillRect/>
                     </a:stretch>
@@ -925,7 +1011,7 @@
         <w:jc w:val="center"/>
       </w:pPr>
       <w:r>
-        <w:t>Figure 7: The entries for sam and danny in /etc/shadow</w:t>
+        <w:t>Figure 8: The entries for sam and danny in /etc/shadow</w:t>
       </w:r>
     </w:p>
     <w:p>
@@ -958,7 +1044,7 @@
         <w:rPr>
           <w:b w:val="0"/>
         </w:rPr>
-        <w:t>The text between the second and third $ (j9T…) is the parameters and the random salt. Because of the salt, two users with the same password would still have different hashes.</w:t>
+        <w:t>The hash field is split by $ signs: $y$ is the algorithm (yescrypt), j9T is the cost parameters, the next part (for sam 43am0NEJx8wuew0QIUSg.) is the random salt, and the last part is the hash itself. Because each user gets a different random salt, two users with the same password would still have different hashes.</w:t>
       </w:r>
     </w:p>
     <w:p>
@@ -993,7 +1079,7 @@
         <w:drawing>
           <wp:inline xmlns:a="http://schemas.openxmlformats.org/drawingml/2006/main" xmlns:pic="http://schemas.openxmlformats.org/drawingml/2006/picture">
             <wp:extent cx="5760000" cy="882066"/>
-            <wp:docPr id="9" name="Picture 9"/>
+            <wp:docPr id="10" name="Picture 10"/>
             <wp:cNvGraphicFramePr>
               <a:graphicFrameLocks noChangeAspect="1"/>
             </wp:cNvGraphicFramePr>
@@ -1005,7 +1091,7 @@
                     <pic:cNvPicPr/>
                   </pic:nvPicPr>
                   <pic:blipFill>
-                    <a:blip r:embed="rId19"/>
+                    <a:blip r:embed="rId20"/>
                     <a:stretch>
                       <a:fillRect/>
                     </a:stretch>
@@ -1030,7 +1116,7 @@
         <w:jc w:val="center"/>
       </w:pPr>
       <w:r>
-        <w:t>Figure 8: Group membership of sam and danny</w:t>
+        <w:t>Figure 9: Group membership of sam and danny</w:t>
       </w:r>
     </w:p>
     <w:p>
@@ -1041,7 +1127,7 @@
         <w:rPr>
           <w:b w:val="0"/>
         </w:rPr>
-        <w:t>Both users are in DEVELOPERS. But I noticed that the group users is missing from the output of id, even though adduser added both users to it (Figure 4). The reason is that usermod -G sets the full list of supplementary groups, so it replaced users with DEVELOPERS. To add a group without removing the others, the correct command is usermod -aG DEVELOPERS sam (-a = append) [2]. In this lab nothing breaks, but on a real system this mistake could silently remove a user from an important group like sudo.</w:t>
+        <w:t>Both users are in DEVELOPERS. But I noticed that the group users is missing from the output of id, even though adduser added both users to it (Figure 5). The reason is that usermod -G sets the full list of supplementary groups, so it replaced users with DEVELOPERS. To add a group without removing the others, the correct command is usermod -aG DEVELOPERS sam (-a = append) [2]. In this lab nothing breaks, but on a real system this mistake could silently remove a user from an important group like sudo.</w:t>
       </w:r>
     </w:p>
     <w:p>
@@ -1081,7 +1167,7 @@
         <w:drawing>
           <wp:inline xmlns:a="http://schemas.openxmlformats.org/drawingml/2006/main" xmlns:pic="http://schemas.openxmlformats.org/drawingml/2006/picture">
             <wp:extent cx="5760000" cy="1622466"/>
-            <wp:docPr id="10" name="Picture 10"/>
+            <wp:docPr id="11" name="Picture 11"/>
             <wp:cNvGraphicFramePr>
               <a:graphicFrameLocks noChangeAspect="1"/>
             </wp:cNvGraphicFramePr>
@@ -1093,7 +1179,7 @@
                     <pic:cNvPicPr/>
                   </pic:nvPicPr>
                   <pic:blipFill>
-                    <a:blip r:embed="rId20"/>
+                    <a:blip r:embed="rId21"/>
                     <a:stretch>
                       <a:fillRect/>
                     </a:stretch>
@@ -1118,7 +1204,7 @@
         <w:jc w:val="center"/>
       </w:pPr>
       <w:r>
-        <w:t>Figure 9: As sam – all home directories are 750 and sam cannot enter danny's folder</w:t>
+        <w:t>Figure 10: As sam – all home directories are 750 and sam cannot enter danny's folder</w:t>
       </w:r>
     </w:p>
     <w:p>
@@ -1142,7 +1228,7 @@
         <w:drawing>
           <wp:inline xmlns:a="http://schemas.openxmlformats.org/drawingml/2006/main" xmlns:pic="http://schemas.openxmlformats.org/drawingml/2006/picture">
             <wp:extent cx="5760000" cy="691200"/>
-            <wp:docPr id="11" name="Picture 11"/>
+            <wp:docPr id="12" name="Picture 12"/>
             <wp:cNvGraphicFramePr>
               <a:graphicFrameLocks noChangeAspect="1"/>
             </wp:cNvGraphicFramePr>
@@ -1154,7 +1240,7 @@
                     <pic:cNvPicPr/>
                   </pic:nvPicPr>
                   <pic:blipFill>
-                    <a:blip r:embed="rId21"/>
+                    <a:blip r:embed="rId22"/>
                     <a:stretch>
                       <a:fillRect/>
                     </a:stretch>
@@ -1179,7 +1265,18 @@
         <w:jc w:val="center"/>
       </w:pPr>
       <w:r>
-        <w:t>Figure 10: HOME_MODE is 0750 in /etc/login.defs In my opinion this is a good change. With 755, any user on the machine can browse other users' files by default, and most people never check this. With 750 the home directory is private unless the owner decides to share it, which follows the principle of least privilege.</w:t>
+        <w:t>Figure 11: HOME_MODE is 0750 in /etc/login.defs</w:t>
+      </w:r>
+    </w:p>
+    <w:p>
+      <w:pPr>
+        <w:jc w:val="both"/>
+      </w:pPr>
+      <w:r>
+        <w:rPr>
+          <w:b w:val="0"/>
+        </w:rPr>
+        <w:t>In my opinion this is a good change. With 755, any user on the machine can browse other users' files by default, and most people never check this. With 750 the home directory is private unless the owner decides to share it, which follows the principle of least privilege.</w:t>
       </w:r>
     </w:p>
     <w:p>
@@ -1211,7 +1308,7 @@
         <w:drawing>
           <wp:inline xmlns:a="http://schemas.openxmlformats.org/drawingml/2006/main" xmlns:pic="http://schemas.openxmlformats.org/drawingml/2006/picture">
             <wp:extent cx="5760000" cy="1262022"/>
-            <wp:docPr id="12" name="Picture 12"/>
+            <wp:docPr id="13" name="Picture 13"/>
             <wp:cNvGraphicFramePr>
               <a:graphicFrameLocks noChangeAspect="1"/>
             </wp:cNvGraphicFramePr>
@@ -1223,7 +1320,7 @@
                     <pic:cNvPicPr/>
                   </pic:nvPicPr>
                   <pic:blipFill>
-                    <a:blip r:embed="rId22"/>
+                    <a:blip r:embed="rId23"/>
                     <a:stretch>
                       <a:fillRect/>
                     </a:stretch>
@@ -1248,7 +1345,7 @@
         <w:jc w:val="center"/>
       </w:pPr>
       <w:r>
-        <w:t>Figure 11: After chmod 755, sam can enter danny's folder but cannot create a file</w:t>
+        <w:t>Figure 12: After chmod 755, sam can enter danny's folder but cannot create a file</w:t>
       </w:r>
     </w:p>
     <w:p>
@@ -1324,7 +1421,7 @@
         <w:drawing>
           <wp:inline xmlns:a="http://schemas.openxmlformats.org/drawingml/2006/main" xmlns:pic="http://schemas.openxmlformats.org/drawingml/2006/picture">
             <wp:extent cx="5760000" cy="809667"/>
-            <wp:docPr id="13" name="Picture 13"/>
+            <wp:docPr id="14" name="Picture 14"/>
             <wp:cNvGraphicFramePr>
               <a:graphicFrameLocks noChangeAspect="1"/>
             </wp:cNvGraphicFramePr>
@@ -1336,7 +1433,7 @@
                     <pic:cNvPicPr/>
                   </pic:nvPicPr>
                   <pic:blipFill>
-                    <a:blip r:embed="rId23"/>
+                    <a:blip r:embed="rId24"/>
                     <a:stretch>
                       <a:fillRect/>
                     </a:stretch>
@@ -1361,7 +1458,7 @@
         <w:jc w:val="center"/>
       </w:pPr>
       <w:r>
-        <w:t>Figure 12: From sam to my admin account and then to root</w:t>
+        <w:t>Figure 13: From sam to my admin account and then to root</w:t>
       </w:r>
     </w:p>
     <w:p>
@@ -1385,7 +1482,7 @@
         <w:drawing>
           <wp:inline xmlns:a="http://schemas.openxmlformats.org/drawingml/2006/main" xmlns:pic="http://schemas.openxmlformats.org/drawingml/2006/picture">
             <wp:extent cx="5760000" cy="1536861"/>
-            <wp:docPr id="14" name="Picture 14"/>
+            <wp:docPr id="15" name="Picture 15"/>
             <wp:cNvGraphicFramePr>
               <a:graphicFrameLocks noChangeAspect="1"/>
             </wp:cNvGraphicFramePr>
@@ -1397,7 +1494,7 @@
                     <pic:cNvPicPr/>
                   </pic:nvPicPr>
                   <pic:blipFill>
-                    <a:blip r:embed="rId24"/>
+                    <a:blip r:embed="rId25"/>
                     <a:stretch>
                       <a:fillRect/>
                     </a:stretch>
@@ -1422,7 +1519,7 @@
         <w:jc w:val="center"/>
       </w:pPr>
       <w:r>
-        <w:t>Figure 13: chmod o-x on danny's home directory</w:t>
+        <w:t>Figure 14: chmod o-x on danny's home directory</w:t>
       </w:r>
     </w:p>
     <w:p>
@@ -1446,7 +1543,7 @@
         <w:drawing>
           <wp:inline xmlns:a="http://schemas.openxmlformats.org/drawingml/2006/main" xmlns:pic="http://schemas.openxmlformats.org/drawingml/2006/picture">
             <wp:extent cx="5760000" cy="1097143"/>
-            <wp:docPr id="15" name="Picture 15"/>
+            <wp:docPr id="16" name="Picture 16"/>
             <wp:cNvGraphicFramePr>
               <a:graphicFrameLocks noChangeAspect="1"/>
             </wp:cNvGraphicFramePr>
@@ -1458,7 +1555,7 @@
                     <pic:cNvPicPr/>
                   </pic:nvPicPr>
                   <pic:blipFill>
-                    <a:blip r:embed="rId25"/>
+                    <a:blip r:embed="rId26"/>
                     <a:stretch>
                       <a:fillRect/>
                     </a:stretch>
@@ -1483,7 +1580,7 @@
         <w:jc w:val="center"/>
       </w:pPr>
       <w:r>
-        <w:t>Figure 14: sam cannot enter danny's folder after o-x</w:t>
+        <w:t>Figure 15: sam cannot enter danny's folder after o-x</w:t>
       </w:r>
     </w:p>
     <w:p>
@@ -1879,7 +1976,7 @@
         <w:drawing>
           <wp:inline xmlns:a="http://schemas.openxmlformats.org/drawingml/2006/main" xmlns:pic="http://schemas.openxmlformats.org/drawingml/2006/picture">
             <wp:extent cx="5760000" cy="3051331"/>
-            <wp:docPr id="16" name="Picture 16"/>
+            <wp:docPr id="17" name="Picture 17"/>
             <wp:cNvGraphicFramePr>
               <a:graphicFrameLocks noChangeAspect="1"/>
             </wp:cNvGraphicFramePr>
@@ -1891,7 +1988,7 @@
                     <pic:cNvPicPr/>
                   </pic:nvPicPr>
                   <pic:blipFill>
-                    <a:blip r:embed="rId26"/>
+                    <a:blip r:embed="rId27"/>
                     <a:stretch>
                       <a:fillRect/>
                     </a:stretch>
@@ -1916,7 +2013,7 @@
         <w:jc w:val="center"/>
       </w:pPr>
       <w:r>
-        <w:t>Figure 15: As danny – chmod 705 and creating test.txt</w:t>
+        <w:t>Figure 16: As danny – chmod 705 and creating test.txt</w:t>
       </w:r>
     </w:p>
     <w:p>
@@ -1951,7 +2048,7 @@
         <w:drawing>
           <wp:inline xmlns:a="http://schemas.openxmlformats.org/drawingml/2006/main" xmlns:pic="http://schemas.openxmlformats.org/drawingml/2006/picture">
             <wp:extent cx="5760000" cy="2095064"/>
-            <wp:docPr id="17" name="Picture 17"/>
+            <wp:docPr id="18" name="Picture 18"/>
             <wp:cNvGraphicFramePr>
               <a:graphicFrameLocks noChangeAspect="1"/>
             </wp:cNvGraphicFramePr>
@@ -1963,7 +2060,7 @@
                     <pic:cNvPicPr/>
                   </pic:nvPicPr>
                   <pic:blipFill>
-                    <a:blip r:embed="rId27"/>
+                    <a:blip r:embed="rId28"/>
                     <a:stretch>
                       <a:fillRect/>
                     </a:stretch>
@@ -1988,7 +2085,7 @@
         <w:jc w:val="center"/>
       </w:pPr>
       <w:r>
-        <w:t>Figure 16: As sam – reading danny's folder works, creating a file is denied</w:t>
+        <w:t>Figure 17: As sam – reading danny's folder works, creating a file is denied</w:t>
       </w:r>
     </w:p>
     <w:p>
@@ -2050,7 +2147,7 @@
         <w:drawing>
           <wp:inline xmlns:a="http://schemas.openxmlformats.org/drawingml/2006/main" xmlns:pic="http://schemas.openxmlformats.org/drawingml/2006/picture">
             <wp:extent cx="5760000" cy="3826154"/>
-            <wp:docPr id="18" name="Picture 18"/>
+            <wp:docPr id="19" name="Picture 19"/>
             <wp:cNvGraphicFramePr>
               <a:graphicFrameLocks noChangeAspect="1"/>
             </wp:cNvGraphicFramePr>
@@ -2062,7 +2159,7 @@
                     <pic:cNvPicPr/>
                   </pic:nvPicPr>
                   <pic:blipFill>
-                    <a:blip r:embed="rId28"/>
+                    <a:blip r:embed="rId29"/>
                     <a:stretch>
                       <a:fillRect/>
                     </a:stretch>
@@ -2087,7 +2184,7 @@
         <w:jc w:val="center"/>
       </w:pPr>
       <w:r>
-        <w:t>Figure 17: The C program, compiling it, and making danny the owner</w:t>
+        <w:t>Figure 18: The C program, compiling it, and making danny the owner</w:t>
       </w:r>
     </w:p>
     <w:p>
@@ -2111,7 +2208,7 @@
         <w:drawing>
           <wp:inline xmlns:a="http://schemas.openxmlformats.org/drawingml/2006/main" xmlns:pic="http://schemas.openxmlformats.org/drawingml/2006/picture">
             <wp:extent cx="5760000" cy="1458167"/>
-            <wp:docPr id="19" name="Picture 19"/>
+            <wp:docPr id="20" name="Picture 20"/>
             <wp:cNvGraphicFramePr>
               <a:graphicFrameLocks noChangeAspect="1"/>
             </wp:cNvGraphicFramePr>
@@ -2123,7 +2220,7 @@
                     <pic:cNvPicPr/>
                   </pic:nvPicPr>
                   <pic:blipFill>
-                    <a:blip r:embed="rId29"/>
+                    <a:blip r:embed="rId30"/>
                     <a:stretch>
                       <a:fillRect/>
                     </a:stretch>
@@ -2148,7 +2245,7 @@
         <w:jc w:val="center"/>
       </w:pPr>
       <w:r>
-        <w:t>Figure 18: Without SUID the program runs as sam, with SUID it runs as danny</w:t>
+        <w:t>Figure 19: Without SUID the program runs as sam, with SUID it runs as danny</w:t>
       </w:r>
     </w:p>
     <w:p>
@@ -2194,7 +2291,7 @@
         <w:drawing>
           <wp:inline xmlns:a="http://schemas.openxmlformats.org/drawingml/2006/main" xmlns:pic="http://schemas.openxmlformats.org/drawingml/2006/picture">
             <wp:extent cx="5760000" cy="369815"/>
-            <wp:docPr id="20" name="Picture 20"/>
+            <wp:docPr id="21" name="Picture 21"/>
             <wp:cNvGraphicFramePr>
               <a:graphicFrameLocks noChangeAspect="1"/>
             </wp:cNvGraphicFramePr>
@@ -2206,7 +2303,7 @@
                     <pic:cNvPicPr/>
                   </pic:nvPicPr>
                   <pic:blipFill>
-                    <a:blip r:embed="rId30"/>
+                    <a:blip r:embed="rId31"/>
                     <a:stretch>
                       <a:fillRect/>
                     </a:stretch>
@@ -2231,7 +2328,7 @@
         <w:jc w:val="center"/>
       </w:pPr>
       <w:r>
-        <w:t>Figure 19: passwd has the SUID bit and is owned by root</w:t>
+        <w:t>Figure 20: passwd has the SUID bit and is owned by root</w:t>
       </w:r>
     </w:p>
     <w:p>
@@ -2242,7 +2339,7 @@
         <w:rPr>
           <w:b w:val="0"/>
         </w:rPr>
-        <w:t>A normal user must be able to change their own password, but the hash is in /etc/shadow, which only root can write. SUID lets passwd run as root for this one job. In my opinion SUID is the most dangerous of the three bits: if a SUID-root program has a bug or lets the user run other commands, any user can become root. That is why administrators should keep the number of SUID files small and check them regularly, for example with find / -perm -4000.</w:t>
+        <w:t>A normal user must be able to change their own password, but the hash is in /etc/shadow, which only root can write. SUID lets passwd run as root for this one job. In my opinion SUID is the most dangerous of the three bits: if a SUID-root program has a bug that lets the user control what it does (for example run another command or write to a file they choose), that user can become root. That is why administrators should keep the number of SUID files small and check them regularly, for example with find / -perm -4000.</w:t>
       </w:r>
     </w:p>
     <w:p>
@@ -2274,7 +2371,7 @@
         <w:drawing>
           <wp:inline xmlns:a="http://schemas.openxmlformats.org/drawingml/2006/main" xmlns:pic="http://schemas.openxmlformats.org/drawingml/2006/picture">
             <wp:extent cx="5760000" cy="1411579"/>
-            <wp:docPr id="21" name="Picture 21"/>
+            <wp:docPr id="22" name="Picture 22"/>
             <wp:cNvGraphicFramePr>
               <a:graphicFrameLocks noChangeAspect="1"/>
             </wp:cNvGraphicFramePr>
@@ -2286,7 +2383,7 @@
                     <pic:cNvPicPr/>
                   </pic:nvPicPr>
                   <pic:blipFill>
-                    <a:blip r:embed="rId31"/>
+                    <a:blip r:embed="rId32"/>
                     <a:stretch>
                       <a:fillRect/>
                     </a:stretch>
@@ -2311,7 +2408,7 @@
         <w:jc w:val="center"/>
       </w:pPr>
       <w:r>
-        <w:t>Figure 20: SGID test – group of files created before and after g+s</w:t>
+        <w:t>Figure 21: SGID test – group of files created before and after g+s</w:t>
       </w:r>
     </w:p>
     <w:p>
@@ -2324,7 +2421,7 @@
         <w:drawing>
           <wp:inline xmlns:a="http://schemas.openxmlformats.org/drawingml/2006/main" xmlns:pic="http://schemas.openxmlformats.org/drawingml/2006/picture">
             <wp:extent cx="5760000" cy="603871"/>
-            <wp:docPr id="22" name="Picture 22"/>
+            <wp:docPr id="23" name="Picture 23"/>
             <wp:cNvGraphicFramePr>
               <a:graphicFrameLocks noChangeAspect="1"/>
             </wp:cNvGraphicFramePr>
@@ -2336,7 +2433,7 @@
                     <pic:cNvPicPr/>
                   </pic:nvPicPr>
                   <pic:blipFill>
-                    <a:blip r:embed="rId32"/>
+                    <a:blip r:embed="rId33"/>
                     <a:stretch>
                       <a:fillRect/>
                     </a:stretch>
@@ -2361,7 +2458,7 @@
         <w:jc w:val="center"/>
       </w:pPr>
       <w:r>
-        <w:t>Figure 21: The shared directory with the SGID bit (drwxrwsr-x)</w:t>
+        <w:t>Figure 22: The shared directory with the SGID bit (drwxrwsr-x)</w:t>
       </w:r>
     </w:p>
     <w:p>
@@ -2372,7 +2469,7 @@
         <w:rPr>
           <w:b w:val="0"/>
         </w:rPr>
-        <w:t>before.txt got the group sam (sam's primary group, the normal behaviour), but after.txt got the group DEVELOPERS, the group of the directory. So with SGID all new files in a shared folder belong to the team's group automatically, and the other members can work with them without someone having to run chgrp each time.</w:t>
+        <w:t>before.txt got the group sam (sam's primary group, the normal behaviour), but after.txt got the group DEVELOPERS, the group of the directory. So with SGID all new files in a shared folder belong to the team's group automatically, and the other members can work with them without someone having to run chgrp each time. SGID on an executable file works differently (the program runs with the file's group, similar to SUID), but I only tested the directory case, which is what this part asked for.</w:t>
       </w:r>
     </w:p>
     <w:p>
@@ -2391,7 +2488,68 @@
         <w:rPr>
           <w:b w:val="0"/>
         </w:rPr>
-        <w:t>I created /tmp/teststicky with mode 777 (everyone can write) and tested if danny can delete a file that belongs to sam, first without and then with the sticky bit.</w:t>
+        <w:t>I created /tmp/teststicky with mode 777 (everyone can write), and sam created sam1.txt in it.</w:t>
+      </w:r>
+    </w:p>
+    <w:p>
+      <w:pPr>
+        <w:keepNext/>
+        <w:spacing w:after="40"/>
+        <w:jc w:val="center"/>
+      </w:pPr>
+      <w:r>
+        <w:drawing>
+          <wp:inline xmlns:a="http://schemas.openxmlformats.org/drawingml/2006/main" xmlns:pic="http://schemas.openxmlformats.org/drawingml/2006/picture">
+            <wp:extent cx="5760000" cy="828983"/>
+            <wp:docPr id="24" name="Picture 24"/>
+            <wp:cNvGraphicFramePr>
+              <a:graphicFrameLocks noChangeAspect="1"/>
+            </wp:cNvGraphicFramePr>
+            <a:graphic>
+              <a:graphicData uri="http://schemas.openxmlformats.org/drawingml/2006/picture">
+                <pic:pic>
+                  <pic:nvPicPr>
+                    <pic:cNvPr id="0" name="c52_sticky_setup.png"/>
+                    <pic:cNvPicPr/>
+                  </pic:nvPicPr>
+                  <pic:blipFill>
+                    <a:blip r:embed="rId34"/>
+                    <a:stretch>
+                      <a:fillRect/>
+                    </a:stretch>
+                  </pic:blipFill>
+                  <pic:spPr>
+                    <a:xfrm>
+                      <a:off x="0" y="0"/>
+                      <a:ext cx="5760000" cy="828983"/>
+                    </a:xfrm>
+                    <a:prstGeom prst="rect"/>
+                  </pic:spPr>
+                </pic:pic>
+              </a:graphicData>
+            </a:graphic>
+          </wp:inline>
+        </w:drawing>
+      </w:r>
+    </w:p>
+    <w:p>
+      <w:pPr>
+        <w:pStyle w:val="Caption"/>
+        <w:jc w:val="center"/>
+      </w:pPr>
+      <w:r>
+        <w:t>Figure 23: Creating the test directory with mode 777 and a file owned by sam</w:t>
+      </w:r>
+    </w:p>
+    <w:p>
+      <w:pPr>
+        <w:jc w:val="both"/>
+      </w:pPr>
+      <w:r>
+        <w:rPr>
+          <w:b w:val="0"/>
+        </w:rPr>
+        <w:t>Then I tested if danny can delete a file that belongs to sam, first without and then with the sticky bit.</w:t>
       </w:r>
     </w:p>
     <w:p>
@@ -2404,7 +2562,7 @@
         <w:drawing>
           <wp:inline xmlns:a="http://schemas.openxmlformats.org/drawingml/2006/main" xmlns:pic="http://schemas.openxmlformats.org/drawingml/2006/picture">
             <wp:extent cx="5760000" cy="2505789"/>
-            <wp:docPr id="23" name="Picture 23"/>
+            <wp:docPr id="25" name="Picture 25"/>
             <wp:cNvGraphicFramePr>
               <a:graphicFrameLocks noChangeAspect="1"/>
             </wp:cNvGraphicFramePr>
@@ -2416,7 +2574,7 @@
                     <pic:cNvPicPr/>
                   </pic:nvPicPr>
                   <pic:blipFill>
-                    <a:blip r:embed="rId33"/>
+                    <a:blip r:embed="rId35"/>
                     <a:stretch>
                       <a:fillRect/>
                     </a:stretch>
@@ -2441,7 +2599,7 @@
         <w:jc w:val="center"/>
       </w:pPr>
       <w:r>
-        <w:t>Figure 22: Sticky bit test</w:t>
+        <w:t>Figure 24: Sticky bit test</w:t>
       </w:r>
     </w:p>
     <w:p>
@@ -2463,7 +2621,7 @@
         <w:rPr>
           <w:b w:val="0"/>
         </w:rPr>
-        <w:t>With chmod +t (drwxrwxrwt, the x of others becomes t): danny got "Operation not permitted" on sam2.txt, but sam could delete his own file. With the sticky bit only the owner of the file, the owner of the directory or root can delete or rename it.</w:t>
+        <w:t>With chmod +t (drwxrwxrwt, the x of others becomes t): danny got "Operation not permitted" on sam2.txt, but sam could delete his own file. According to the chmod documentation, with the sticky bit only the owner of the file, the owner of the directory or root can delete or rename it [4]. I tested the file owner (sam) and another user (danny); in my first attempt (described below) root also deleted danny.txt from the directory while the sticky bit was set.</w:t>
       </w:r>
     </w:p>
     <w:p>
@@ -2485,7 +2643,57 @@
         <w:rPr>
           <w:b w:val="0"/>
         </w:rPr>
-        <w:t>In my first attempt at this test I used rm without -f. Because the files are not writable by danny, rm asked "remove write-protected regular empty file?" and pressing Enter answered no, so nothing was really tested. I repeated the test with rm -f, which does not ask.</w:t>
+        <w:t>In my first attempt at this test I used rm without -f. Because the files are not writable by danny, rm asked "remove write-protected regular empty file?" and pressing Enter answered no, so nothing was really tested. I repeated the test with rm -f, which does not ask. The first attempt still shows one useful result: with the sticky bit set, root deleted danny.txt (a file owned by danny) without any problem.</w:t>
+      </w:r>
+    </w:p>
+    <w:p>
+      <w:pPr>
+        <w:keepNext/>
+        <w:spacing w:after="40"/>
+        <w:jc w:val="center"/>
+      </w:pPr>
+      <w:r>
+        <w:drawing>
+          <wp:inline xmlns:a="http://schemas.openxmlformats.org/drawingml/2006/main" xmlns:pic="http://schemas.openxmlformats.org/drawingml/2006/picture">
+            <wp:extent cx="5760000" cy="1476923"/>
+            <wp:docPr id="26" name="Picture 26"/>
+            <wp:cNvGraphicFramePr>
+              <a:graphicFrameLocks noChangeAspect="1"/>
+            </wp:cNvGraphicFramePr>
+            <a:graphic>
+              <a:graphicData uri="http://schemas.openxmlformats.org/drawingml/2006/picture">
+                <pic:pic>
+                  <pic:nvPicPr>
+                    <pic:cNvPr id="0" name="c52_first_attempt.png"/>
+                    <pic:cNvPicPr/>
+                  </pic:nvPicPr>
+                  <pic:blipFill>
+                    <a:blip r:embed="rId36"/>
+                    <a:stretch>
+                      <a:fillRect/>
+                    </a:stretch>
+                  </pic:blipFill>
+                  <pic:spPr>
+                    <a:xfrm>
+                      <a:off x="0" y="0"/>
+                      <a:ext cx="5760000" cy="1476923"/>
+                    </a:xfrm>
+                    <a:prstGeom prst="rect"/>
+                  </pic:spPr>
+                </pic:pic>
+              </a:graphicData>
+            </a:graphic>
+          </wp:inline>
+        </w:drawing>
+      </w:r>
+    </w:p>
+    <w:p>
+      <w:pPr>
+        <w:pStyle w:val="Caption"/>
+        <w:jc w:val="center"/>
+      </w:pPr>
+      <w:r>
+        <w:t>Figure 25: First attempt – rm asked for confirmation, and root deleted danny's file with the sticky bit set</w:t>
       </w:r>
     </w:p>
     <w:p>

</xml_diff>

<commit_message>
Lab 3 Part A: add sudo su, chfn, shadow and umask evidence
Co-Authored-By: Claude Opus 5.5 <noreply@anthropic.com>
Claude-Session: https://claude.ai/code/session_015FzNpWvVcgtCUNTKwZzDr2
</commit_message>
<xml_diff>
--- a/lab3_report/ITE408_Lab3_Report_1093911.docx
+++ b/lab3_report/ITE408_Lab3_Report_1093911.docx
@@ -474,7 +474,68 @@
         <w:rPr>
           <w:b w:val="0"/>
         </w:rPr>
-        <w:t>First I became root with sudo su. Since every screenshot must show my student ID, and in this lab it is also important to see which user is running each command, I changed the prompt to show the date, time, my ID and the current user and folder. I added the same line to /etc/skel/.bashrc before creating the new users, because every new user gets a copy of this file in their home directory, so sam and danny would also get the prompt automatically.</w:t>
+        <w:t>First I became root with sudo su (the screenshot below was taken later in the session, so the working directory is different, but the step is the same).</w:t>
+      </w:r>
+    </w:p>
+    <w:p>
+      <w:pPr>
+        <w:keepNext/>
+        <w:spacing w:after="40"/>
+        <w:jc w:val="center"/>
+      </w:pPr>
+      <w:r>
+        <w:drawing>
+          <wp:inline xmlns:a="http://schemas.openxmlformats.org/drawingml/2006/main" xmlns:pic="http://schemas.openxmlformats.org/drawingml/2006/picture">
+            <wp:extent cx="5760000" cy="458343"/>
+            <wp:docPr id="2" name="Picture 2"/>
+            <wp:cNvGraphicFramePr>
+              <a:graphicFrameLocks noChangeAspect="1"/>
+            </wp:cNvGraphicFramePr>
+            <a:graphic>
+              <a:graphicData uri="http://schemas.openxmlformats.org/drawingml/2006/picture">
+                <pic:pic>
+                  <pic:nvPicPr>
+                    <pic:cNvPr id="0" name="c58_sudo.png"/>
+                    <pic:cNvPicPr/>
+                  </pic:nvPicPr>
+                  <pic:blipFill>
+                    <a:blip r:embed="rId12"/>
+                    <a:stretch>
+                      <a:fillRect/>
+                    </a:stretch>
+                  </pic:blipFill>
+                  <pic:spPr>
+                    <a:xfrm>
+                      <a:off x="0" y="0"/>
+                      <a:ext cx="5760000" cy="458343"/>
+                    </a:xfrm>
+                    <a:prstGeom prst="rect"/>
+                  </pic:spPr>
+                </pic:pic>
+              </a:graphicData>
+            </a:graphic>
+          </wp:inline>
+        </w:drawing>
+      </w:r>
+    </w:p>
+    <w:p>
+      <w:pPr>
+        <w:pStyle w:val="Caption"/>
+        <w:jc w:val="center"/>
+      </w:pPr>
+      <w:r>
+        <w:t>Figure 1: Becoming root with sudo su</w:t>
+      </w:r>
+    </w:p>
+    <w:p>
+      <w:pPr>
+        <w:jc w:val="both"/>
+      </w:pPr>
+      <w:r>
+        <w:rPr>
+          <w:b w:val="0"/>
+        </w:rPr>
+        <w:t>Since every screenshot must show my student ID, and in this lab it is also important to see which user is running each command, I changed the prompt to show the date, time, my ID and the current user and folder. I added the same line to /etc/skel/.bashrc before creating the new users, because every new user gets a copy of this file in their home directory, so sam and danny would also get the prompt automatically.</w:t>
       </w:r>
     </w:p>
     <w:p>
@@ -487,7 +548,7 @@
         <w:drawing>
           <wp:inline xmlns:a="http://schemas.openxmlformats.org/drawingml/2006/main" xmlns:pic="http://schemas.openxmlformats.org/drawingml/2006/picture">
             <wp:extent cx="5760000" cy="728276"/>
-            <wp:docPr id="2" name="Picture 2"/>
+            <wp:docPr id="3" name="Picture 3"/>
             <wp:cNvGraphicFramePr>
               <a:graphicFrameLocks noChangeAspect="1"/>
             </wp:cNvGraphicFramePr>
@@ -499,7 +560,7 @@
                     <pic:cNvPicPr/>
                   </pic:nvPicPr>
                   <pic:blipFill>
-                    <a:blip r:embed="rId12"/>
+                    <a:blip r:embed="rId13"/>
                     <a:stretch>
                       <a:fillRect/>
                     </a:stretch>
@@ -524,7 +585,7 @@
         <w:jc w:val="center"/>
       </w:pPr>
       <w:r>
-        <w:t>Figure 1: Setting the prompt for root, for new users (/etc/skel) and for my own account</w:t>
+        <w:t>Figure 2: Setting the prompt for root, for new users (/etc/skel) and for my own account</w:t>
       </w:r>
     </w:p>
     <w:p>
@@ -573,7 +634,7 @@
         <w:drawing>
           <wp:inline xmlns:a="http://schemas.openxmlformats.org/drawingml/2006/main" xmlns:pic="http://schemas.openxmlformats.org/drawingml/2006/picture">
             <wp:extent cx="5760000" cy="852480"/>
-            <wp:docPr id="3" name="Picture 3"/>
+            <wp:docPr id="4" name="Picture 4"/>
             <wp:cNvGraphicFramePr>
               <a:graphicFrameLocks noChangeAspect="1"/>
             </wp:cNvGraphicFramePr>
@@ -585,7 +646,7 @@
                     <pic:cNvPicPr/>
                   </pic:nvPicPr>
                   <pic:blipFill>
-                    <a:blip r:embed="rId13"/>
+                    <a:blip r:embed="rId14"/>
                     <a:stretch>
                       <a:fillRect/>
                     </a:stretch>
@@ -610,7 +671,7 @@
         <w:jc w:val="center"/>
       </w:pPr>
       <w:r>
-        <w:t>Figure 2: Fixing the prompt – after the fix the root prompt ends with #</w:t>
+        <w:t>Figure 3: Fixing the prompt – after the fix the root prompt ends with #</w:t>
       </w:r>
     </w:p>
     <w:p>
@@ -642,7 +703,7 @@
         <w:drawing>
           <wp:inline xmlns:a="http://schemas.openxmlformats.org/drawingml/2006/main" xmlns:pic="http://schemas.openxmlformats.org/drawingml/2006/picture">
             <wp:extent cx="5760000" cy="246154"/>
-            <wp:docPr id="4" name="Picture 4"/>
+            <wp:docPr id="5" name="Picture 5"/>
             <wp:cNvGraphicFramePr>
               <a:graphicFrameLocks noChangeAspect="1"/>
             </wp:cNvGraphicFramePr>
@@ -654,7 +715,7 @@
                     <pic:cNvPicPr/>
                   </pic:nvPicPr>
                   <pic:blipFill>
-                    <a:blip r:embed="rId14"/>
+                    <a:blip r:embed="rId15"/>
                     <a:stretch>
                       <a:fillRect/>
                     </a:stretch>
@@ -679,7 +740,7 @@
         <w:jc w:val="center"/>
       </w:pPr>
       <w:r>
-        <w:t>Figure 3: Creating the DEVELOPERS group</w:t>
+        <w:t>Figure 4: Creating the DEVELOPERS group</w:t>
       </w:r>
     </w:p>
     <w:p>
@@ -703,7 +764,7 @@
         <w:drawing>
           <wp:inline xmlns:a="http://schemas.openxmlformats.org/drawingml/2006/main" xmlns:pic="http://schemas.openxmlformats.org/drawingml/2006/picture">
             <wp:extent cx="5760000" cy="1728000"/>
-            <wp:docPr id="5" name="Picture 5"/>
+            <wp:docPr id="6" name="Picture 6"/>
             <wp:cNvGraphicFramePr>
               <a:graphicFrameLocks noChangeAspect="1"/>
             </wp:cNvGraphicFramePr>
@@ -715,7 +776,7 @@
                     <pic:cNvPicPr/>
                   </pic:nvPicPr>
                   <pic:blipFill>
-                    <a:blip r:embed="rId15"/>
+                    <a:blip r:embed="rId16"/>
                     <a:stretch>
                       <a:fillRect/>
                     </a:stretch>
@@ -740,7 +801,7 @@
         <w:jc w:val="center"/>
       </w:pPr>
       <w:r>
-        <w:t>Figure 4: The DEVELOPERS group at the end of /etc/group</w:t>
+        <w:t>Figure 5: The DEVELOPERS group at the end of /etc/group</w:t>
       </w:r>
     </w:p>
     <w:p>
@@ -770,7 +831,7 @@
         <w:rPr>
           <w:b w:val="0"/>
         </w:rPr>
-        <w:t>I created sam with adduser sam. adduser is the interactive Debian/Ubuntu tool: it creates the user and a private group with the same name, makes the home directory, copies the files from /etc/skel, asks for the password (samPass) and then asks for the GECOS information. For the full name I entered my own text instead of "Sam", so it appears in /etc/passwd later. At the end adduser also added sam to the extra group users.</w:t>
+        <w:t>I created sam with adduser sam. adduser is the interactive Debian/Ubuntu tool: it creates the user and a private group with the same name, makes the home directory, copies the files from /etc/skel, asks for the password (samPass) and then asks for the GECOS information. For the full name I first entered my own text instead of "Sam", and later corrected it with chfn (Figure 9). At the end adduser also added sam to the extra group users.</w:t>
       </w:r>
     </w:p>
     <w:p>
@@ -783,7 +844,7 @@
         <w:drawing>
           <wp:inline xmlns:a="http://schemas.openxmlformats.org/drawingml/2006/main" xmlns:pic="http://schemas.openxmlformats.org/drawingml/2006/picture">
             <wp:extent cx="5760000" cy="2926302"/>
-            <wp:docPr id="6" name="Picture 6"/>
+            <wp:docPr id="7" name="Picture 7"/>
             <wp:cNvGraphicFramePr>
               <a:graphicFrameLocks noChangeAspect="1"/>
             </wp:cNvGraphicFramePr>
@@ -795,7 +856,7 @@
                     <pic:cNvPicPr/>
                   </pic:nvPicPr>
                   <pic:blipFill>
-                    <a:blip r:embed="rId16"/>
+                    <a:blip r:embed="rId17"/>
                     <a:stretch>
                       <a:fillRect/>
                     </a:stretch>
@@ -820,7 +881,7 @@
         <w:jc w:val="center"/>
       </w:pPr>
       <w:r>
-        <w:t>Figure 5: Creating the user sam with adduser</w:t>
+        <w:t>Figure 6: Creating the user sam with adduser</w:t>
       </w:r>
     </w:p>
     <w:p>
@@ -844,7 +905,7 @@
         <w:drawing>
           <wp:inline xmlns:a="http://schemas.openxmlformats.org/drawingml/2006/main" xmlns:pic="http://schemas.openxmlformats.org/drawingml/2006/picture">
             <wp:extent cx="5760000" cy="2491880"/>
-            <wp:docPr id="7" name="Picture 7"/>
+            <wp:docPr id="8" name="Picture 8"/>
             <wp:cNvGraphicFramePr>
               <a:graphicFrameLocks noChangeAspect="1"/>
             </wp:cNvGraphicFramePr>
@@ -856,7 +917,7 @@
                     <pic:cNvPicPr/>
                   </pic:nvPicPr>
                   <pic:blipFill>
-                    <a:blip r:embed="rId17"/>
+                    <a:blip r:embed="rId18"/>
                     <a:stretch>
                       <a:fillRect/>
                     </a:stretch>
@@ -881,7 +942,7 @@
         <w:jc w:val="center"/>
       </w:pPr>
       <w:r>
-        <w:t>Figure 6: Adding sam to DEVELOPERS and creating danny</w:t>
+        <w:t>Figure 7: Adding sam to DEVELOPERS and creating danny</w:t>
       </w:r>
     </w:p>
     <w:p>
@@ -913,7 +974,7 @@
         <w:drawing>
           <wp:inline xmlns:a="http://schemas.openxmlformats.org/drawingml/2006/main" xmlns:pic="http://schemas.openxmlformats.org/drawingml/2006/picture">
             <wp:extent cx="5760000" cy="1042924"/>
-            <wp:docPr id="8" name="Picture 8"/>
+            <wp:docPr id="9" name="Picture 9"/>
             <wp:cNvGraphicFramePr>
               <a:graphicFrameLocks noChangeAspect="1"/>
             </wp:cNvGraphicFramePr>
@@ -925,7 +986,7 @@
                     <pic:cNvPicPr/>
                   </pic:nvPicPr>
                   <pic:blipFill>
-                    <a:blip r:embed="rId18"/>
+                    <a:blip r:embed="rId19"/>
                     <a:stretch>
                       <a:fillRect/>
                     </a:stretch>
@@ -950,7 +1011,7 @@
         <w:jc w:val="center"/>
       </w:pPr>
       <w:r>
-        <w:t>Figure 7: The new users at the end of /etc/passwd</w:t>
+        <w:t>Figure 8: The new users at the end of /etc/passwd</w:t>
       </w:r>
     </w:p>
     <w:p>
@@ -961,7 +1022,7 @@
         <w:rPr>
           <w:b w:val="0"/>
         </w:rPr>
-        <w:t>The hashes are kept in /etc/shadow, which only root can read.</w:t>
+        <w:t>Because the lab asks for the full names Sam and Danny, I corrected the GECOS field with chfn and checked /etc/passwd again:</w:t>
       </w:r>
     </w:p>
     <w:p>
@@ -973,8 +1034,8 @@
       <w:r>
         <w:drawing>
           <wp:inline xmlns:a="http://schemas.openxmlformats.org/drawingml/2006/main" xmlns:pic="http://schemas.openxmlformats.org/drawingml/2006/picture">
-            <wp:extent cx="5760000" cy="318483"/>
-            <wp:docPr id="9" name="Picture 9"/>
+            <wp:extent cx="5760000" cy="538671"/>
+            <wp:docPr id="10" name="Picture 10"/>
             <wp:cNvGraphicFramePr>
               <a:graphicFrameLocks noChangeAspect="1"/>
             </wp:cNvGraphicFramePr>
@@ -982,11 +1043,11 @@
               <a:graphicData uri="http://schemas.openxmlformats.org/drawingml/2006/picture">
                 <pic:pic>
                   <pic:nvPicPr>
-                    <pic:cNvPr id="0" name="a40.png"/>
+                    <pic:cNvPr id="0" name="c58_chfn.png"/>
                     <pic:cNvPicPr/>
                   </pic:nvPicPr>
                   <pic:blipFill>
-                    <a:blip r:embed="rId19"/>
+                    <a:blip r:embed="rId20"/>
                     <a:stretch>
                       <a:fillRect/>
                     </a:stretch>
@@ -994,7 +1055,7 @@
                   <pic:spPr>
                     <a:xfrm>
                       <a:off x="0" y="0"/>
-                      <a:ext cx="5760000" cy="318483"/>
+                      <a:ext cx="5760000" cy="538671"/>
                     </a:xfrm>
                     <a:prstGeom prst="rect"/>
                   </pic:spPr>
@@ -1011,7 +1072,68 @@
         <w:jc w:val="center"/>
       </w:pPr>
       <w:r>
-        <w:t>Figure 8: The entries for sam and danny in /etc/shadow</w:t>
+        <w:t>Figure 9: Setting the full names to Sam and Danny with chfn</w:t>
+      </w:r>
+    </w:p>
+    <w:p>
+      <w:pPr>
+        <w:jc w:val="both"/>
+      </w:pPr>
+      <w:r>
+        <w:rPr>
+          <w:b w:val="0"/>
+        </w:rPr>
+        <w:t>The hashes are kept in /etc/shadow, which only root can read.</w:t>
+      </w:r>
+    </w:p>
+    <w:p>
+      <w:pPr>
+        <w:keepNext/>
+        <w:spacing w:after="40"/>
+        <w:jc w:val="center"/>
+      </w:pPr>
+      <w:r>
+        <w:drawing>
+          <wp:inline xmlns:a="http://schemas.openxmlformats.org/drawingml/2006/main" xmlns:pic="http://schemas.openxmlformats.org/drawingml/2006/picture">
+            <wp:extent cx="5760000" cy="316587"/>
+            <wp:docPr id="11" name="Picture 11"/>
+            <wp:cNvGraphicFramePr>
+              <a:graphicFrameLocks noChangeAspect="1"/>
+            </wp:cNvGraphicFramePr>
+            <a:graphic>
+              <a:graphicData uri="http://schemas.openxmlformats.org/drawingml/2006/picture">
+                <pic:pic>
+                  <pic:nvPicPr>
+                    <pic:cNvPr id="0" name="c58_shadow.png"/>
+                    <pic:cNvPicPr/>
+                  </pic:nvPicPr>
+                  <pic:blipFill>
+                    <a:blip r:embed="rId21"/>
+                    <a:stretch>
+                      <a:fillRect/>
+                    </a:stretch>
+                  </pic:blipFill>
+                  <pic:spPr>
+                    <a:xfrm>
+                      <a:off x="0" y="0"/>
+                      <a:ext cx="5760000" cy="316587"/>
+                    </a:xfrm>
+                    <a:prstGeom prst="rect"/>
+                  </pic:spPr>
+                </pic:pic>
+              </a:graphicData>
+            </a:graphic>
+          </wp:inline>
+        </w:drawing>
+      </w:r>
+    </w:p>
+    <w:p>
+      <w:pPr>
+        <w:pStyle w:val="Caption"/>
+        <w:jc w:val="center"/>
+      </w:pPr>
+      <w:r>
+        <w:t>Figure 10: The entries for sam and danny in /etc/shadow</w:t>
       </w:r>
     </w:p>
     <w:p>
@@ -1079,7 +1201,7 @@
         <w:drawing>
           <wp:inline xmlns:a="http://schemas.openxmlformats.org/drawingml/2006/main" xmlns:pic="http://schemas.openxmlformats.org/drawingml/2006/picture">
             <wp:extent cx="5760000" cy="882066"/>
-            <wp:docPr id="10" name="Picture 10"/>
+            <wp:docPr id="12" name="Picture 12"/>
             <wp:cNvGraphicFramePr>
               <a:graphicFrameLocks noChangeAspect="1"/>
             </wp:cNvGraphicFramePr>
@@ -1091,7 +1213,7 @@
                     <pic:cNvPicPr/>
                   </pic:nvPicPr>
                   <pic:blipFill>
-                    <a:blip r:embed="rId20"/>
+                    <a:blip r:embed="rId22"/>
                     <a:stretch>
                       <a:fillRect/>
                     </a:stretch>
@@ -1116,7 +1238,7 @@
         <w:jc w:val="center"/>
       </w:pPr>
       <w:r>
-        <w:t>Figure 9: Group membership of sam and danny</w:t>
+        <w:t>Figure 11: Group membership of sam and danny</w:t>
       </w:r>
     </w:p>
     <w:p>
@@ -1127,7 +1249,7 @@
         <w:rPr>
           <w:b w:val="0"/>
         </w:rPr>
-        <w:t>Both users are in DEVELOPERS. But I noticed that the group users is missing from the output of id, even though adduser added both users to it (Figure 5). The reason is that usermod -G sets the full list of supplementary groups, so it replaced users with DEVELOPERS. To add a group without removing the others, the correct command is usermod -aG DEVELOPERS sam (-a = append) [2]. In this lab nothing breaks, but on a real system this mistake could silently remove a user from an important group like sudo.</w:t>
+        <w:t>Both users are in DEVELOPERS. But I noticed that the group users is missing from the output of id, even though adduser added both users to it (Figure 6). The reason is that usermod -G sets the full list of supplementary groups, so it replaced users with DEVELOPERS. To add a group without removing the others, the correct command is usermod -aG DEVELOPERS sam (-a = append) [2]. In this lab nothing breaks, but on a real system this mistake could silently remove a user from an important group like sudo.</w:t>
       </w:r>
     </w:p>
     <w:p>
@@ -1167,7 +1289,7 @@
         <w:drawing>
           <wp:inline xmlns:a="http://schemas.openxmlformats.org/drawingml/2006/main" xmlns:pic="http://schemas.openxmlformats.org/drawingml/2006/picture">
             <wp:extent cx="5760000" cy="1622466"/>
-            <wp:docPr id="11" name="Picture 11"/>
+            <wp:docPr id="13" name="Picture 13"/>
             <wp:cNvGraphicFramePr>
               <a:graphicFrameLocks noChangeAspect="1"/>
             </wp:cNvGraphicFramePr>
@@ -1179,7 +1301,7 @@
                     <pic:cNvPicPr/>
                   </pic:nvPicPr>
                   <pic:blipFill>
-                    <a:blip r:embed="rId21"/>
+                    <a:blip r:embed="rId23"/>
                     <a:stretch>
                       <a:fillRect/>
                     </a:stretch>
@@ -1204,7 +1326,7 @@
         <w:jc w:val="center"/>
       </w:pPr>
       <w:r>
-        <w:t>Figure 10: As sam – all home directories are 750 and sam cannot enter danny's folder</w:t>
+        <w:t>Figure 12: As sam – all home directories are 750 and sam cannot enter danny's folder</w:t>
       </w:r>
     </w:p>
     <w:p>
@@ -1228,7 +1350,7 @@
         <w:drawing>
           <wp:inline xmlns:a="http://schemas.openxmlformats.org/drawingml/2006/main" xmlns:pic="http://schemas.openxmlformats.org/drawingml/2006/picture">
             <wp:extent cx="5760000" cy="691200"/>
-            <wp:docPr id="12" name="Picture 12"/>
+            <wp:docPr id="14" name="Picture 14"/>
             <wp:cNvGraphicFramePr>
               <a:graphicFrameLocks noChangeAspect="1"/>
             </wp:cNvGraphicFramePr>
@@ -1240,7 +1362,7 @@
                     <pic:cNvPicPr/>
                   </pic:nvPicPr>
                   <pic:blipFill>
-                    <a:blip r:embed="rId22"/>
+                    <a:blip r:embed="rId24"/>
                     <a:stretch>
                       <a:fillRect/>
                     </a:stretch>
@@ -1265,7 +1387,7 @@
         <w:jc w:val="center"/>
       </w:pPr>
       <w:r>
-        <w:t>Figure 11: HOME_MODE is 0750 in /etc/login.defs</w:t>
+        <w:t>Figure 13: HOME_MODE is 0750 in /etc/login.defs</w:t>
       </w:r>
     </w:p>
     <w:p>
@@ -1308,7 +1430,7 @@
         <w:drawing>
           <wp:inline xmlns:a="http://schemas.openxmlformats.org/drawingml/2006/main" xmlns:pic="http://schemas.openxmlformats.org/drawingml/2006/picture">
             <wp:extent cx="5760000" cy="1262022"/>
-            <wp:docPr id="13" name="Picture 13"/>
+            <wp:docPr id="15" name="Picture 15"/>
             <wp:cNvGraphicFramePr>
               <a:graphicFrameLocks noChangeAspect="1"/>
             </wp:cNvGraphicFramePr>
@@ -1320,7 +1442,7 @@
                     <pic:cNvPicPr/>
                   </pic:nvPicPr>
                   <pic:blipFill>
-                    <a:blip r:embed="rId23"/>
+                    <a:blip r:embed="rId25"/>
                     <a:stretch>
                       <a:fillRect/>
                     </a:stretch>
@@ -1345,7 +1467,7 @@
         <w:jc w:val="center"/>
       </w:pPr>
       <w:r>
-        <w:t>Figure 12: After chmod 755, sam can enter danny's folder but cannot create a file</w:t>
+        <w:t>Figure 14: After chmod 755, sam can enter danny's folder but cannot create a file</w:t>
       </w:r>
     </w:p>
     <w:p>
@@ -1421,7 +1543,7 @@
         <w:drawing>
           <wp:inline xmlns:a="http://schemas.openxmlformats.org/drawingml/2006/main" xmlns:pic="http://schemas.openxmlformats.org/drawingml/2006/picture">
             <wp:extent cx="5760000" cy="809667"/>
-            <wp:docPr id="14" name="Picture 14"/>
+            <wp:docPr id="16" name="Picture 16"/>
             <wp:cNvGraphicFramePr>
               <a:graphicFrameLocks noChangeAspect="1"/>
             </wp:cNvGraphicFramePr>
@@ -1433,7 +1555,7 @@
                     <pic:cNvPicPr/>
                   </pic:nvPicPr>
                   <pic:blipFill>
-                    <a:blip r:embed="rId24"/>
+                    <a:blip r:embed="rId26"/>
                     <a:stretch>
                       <a:fillRect/>
                     </a:stretch>
@@ -1458,7 +1580,7 @@
         <w:jc w:val="center"/>
       </w:pPr>
       <w:r>
-        <w:t>Figure 13: From sam to my admin account and then to root</w:t>
+        <w:t>Figure 15: From sam to my admin account and then to root</w:t>
       </w:r>
     </w:p>
     <w:p>
@@ -1482,7 +1604,7 @@
         <w:drawing>
           <wp:inline xmlns:a="http://schemas.openxmlformats.org/drawingml/2006/main" xmlns:pic="http://schemas.openxmlformats.org/drawingml/2006/picture">
             <wp:extent cx="5760000" cy="1536861"/>
-            <wp:docPr id="15" name="Picture 15"/>
+            <wp:docPr id="17" name="Picture 17"/>
             <wp:cNvGraphicFramePr>
               <a:graphicFrameLocks noChangeAspect="1"/>
             </wp:cNvGraphicFramePr>
@@ -1494,7 +1616,7 @@
                     <pic:cNvPicPr/>
                   </pic:nvPicPr>
                   <pic:blipFill>
-                    <a:blip r:embed="rId25"/>
+                    <a:blip r:embed="rId27"/>
                     <a:stretch>
                       <a:fillRect/>
                     </a:stretch>
@@ -1519,7 +1641,7 @@
         <w:jc w:val="center"/>
       </w:pPr>
       <w:r>
-        <w:t>Figure 14: chmod o-x on danny's home directory</w:t>
+        <w:t>Figure 16: chmod o-x on danny's home directory</w:t>
       </w:r>
     </w:p>
     <w:p>
@@ -1543,7 +1665,7 @@
         <w:drawing>
           <wp:inline xmlns:a="http://schemas.openxmlformats.org/drawingml/2006/main" xmlns:pic="http://schemas.openxmlformats.org/drawingml/2006/picture">
             <wp:extent cx="5760000" cy="1097143"/>
-            <wp:docPr id="16" name="Picture 16"/>
+            <wp:docPr id="18" name="Picture 18"/>
             <wp:cNvGraphicFramePr>
               <a:graphicFrameLocks noChangeAspect="1"/>
             </wp:cNvGraphicFramePr>
@@ -1555,7 +1677,7 @@
                     <pic:cNvPicPr/>
                   </pic:nvPicPr>
                   <pic:blipFill>
-                    <a:blip r:embed="rId26"/>
+                    <a:blip r:embed="rId28"/>
                     <a:stretch>
                       <a:fillRect/>
                     </a:stretch>
@@ -1580,7 +1702,7 @@
         <w:jc w:val="center"/>
       </w:pPr>
       <w:r>
-        <w:t>Figure 15: sam cannot enter danny's folder after o-x</w:t>
+        <w:t>Figure 17: sam cannot enter danny's folder after o-x</w:t>
       </w:r>
     </w:p>
     <w:p>
@@ -1976,7 +2098,7 @@
         <w:drawing>
           <wp:inline xmlns:a="http://schemas.openxmlformats.org/drawingml/2006/main" xmlns:pic="http://schemas.openxmlformats.org/drawingml/2006/picture">
             <wp:extent cx="5760000" cy="3051331"/>
-            <wp:docPr id="17" name="Picture 17"/>
+            <wp:docPr id="19" name="Picture 19"/>
             <wp:cNvGraphicFramePr>
               <a:graphicFrameLocks noChangeAspect="1"/>
             </wp:cNvGraphicFramePr>
@@ -1988,7 +2110,7 @@
                     <pic:cNvPicPr/>
                   </pic:nvPicPr>
                   <pic:blipFill>
-                    <a:blip r:embed="rId27"/>
+                    <a:blip r:embed="rId29"/>
                     <a:stretch>
                       <a:fillRect/>
                     </a:stretch>
@@ -2013,7 +2135,7 @@
         <w:jc w:val="center"/>
       </w:pPr>
       <w:r>
-        <w:t>Figure 16: As danny – chmod 705 and creating test.txt</w:t>
+        <w:t>Figure 18: As danny – chmod 705 and creating test.txt</w:t>
       </w:r>
     </w:p>
     <w:p>
@@ -2024,7 +2146,57 @@
         <w:rPr>
           <w:b w:val="0"/>
         </w:rPr>
-        <w:t>The directory changed from drwxr-xr-- to drwx---r-x. Then danny created test.txt. The new file got -rw-rw-r-- (664) without any chmod. This comes from the default umask 002 for normal users: new files start from 666 and the umask removes write from others.</w:t>
+        <w:t>The directory changed from drwxr-xr-- to drwx---r-x. Then danny created test.txt. The new file got -rw-rw-r-- (664) without any chmod. This comes from the default umask 002 for normal users: new files start from 666 and the umask removes write from others. I confirmed the umask by running it as danny:</w:t>
+      </w:r>
+    </w:p>
+    <w:p>
+      <w:pPr>
+        <w:keepNext/>
+        <w:spacing w:after="40"/>
+        <w:jc w:val="center"/>
+      </w:pPr>
+      <w:r>
+        <w:drawing>
+          <wp:inline xmlns:a="http://schemas.openxmlformats.org/drawingml/2006/main" xmlns:pic="http://schemas.openxmlformats.org/drawingml/2006/picture">
+            <wp:extent cx="5760000" cy="524495"/>
+            <wp:docPr id="20" name="Picture 20"/>
+            <wp:cNvGraphicFramePr>
+              <a:graphicFrameLocks noChangeAspect="1"/>
+            </wp:cNvGraphicFramePr>
+            <a:graphic>
+              <a:graphicData uri="http://schemas.openxmlformats.org/drawingml/2006/picture">
+                <pic:pic>
+                  <pic:nvPicPr>
+                    <pic:cNvPr id="0" name="c58_umask.png"/>
+                    <pic:cNvPicPr/>
+                  </pic:nvPicPr>
+                  <pic:blipFill>
+                    <a:blip r:embed="rId30"/>
+                    <a:stretch>
+                      <a:fillRect/>
+                    </a:stretch>
+                  </pic:blipFill>
+                  <pic:spPr>
+                    <a:xfrm>
+                      <a:off x="0" y="0"/>
+                      <a:ext cx="5760000" cy="524495"/>
+                    </a:xfrm>
+                    <a:prstGeom prst="rect"/>
+                  </pic:spPr>
+                </pic:pic>
+              </a:graphicData>
+            </a:graphic>
+          </wp:inline>
+        </w:drawing>
+      </w:r>
+    </w:p>
+    <w:p>
+      <w:pPr>
+        <w:pStyle w:val="Caption"/>
+        <w:jc w:val="center"/>
+      </w:pPr>
+      <w:r>
+        <w:t>Figure 19: danny's umask is 0002, and test.txt is -rw-rw-r--</w:t>
       </w:r>
     </w:p>
     <w:p>
@@ -2048,7 +2220,7 @@
         <w:drawing>
           <wp:inline xmlns:a="http://schemas.openxmlformats.org/drawingml/2006/main" xmlns:pic="http://schemas.openxmlformats.org/drawingml/2006/picture">
             <wp:extent cx="5760000" cy="2095064"/>
-            <wp:docPr id="18" name="Picture 18"/>
+            <wp:docPr id="21" name="Picture 21"/>
             <wp:cNvGraphicFramePr>
               <a:graphicFrameLocks noChangeAspect="1"/>
             </wp:cNvGraphicFramePr>
@@ -2060,7 +2232,7 @@
                     <pic:cNvPicPr/>
                   </pic:nvPicPr>
                   <pic:blipFill>
-                    <a:blip r:embed="rId28"/>
+                    <a:blip r:embed="rId31"/>
                     <a:stretch>
                       <a:fillRect/>
                     </a:stretch>
@@ -2085,7 +2257,7 @@
         <w:jc w:val="center"/>
       </w:pPr>
       <w:r>
-        <w:t>Figure 17: As sam – reading danny's folder works, creating a file is denied</w:t>
+        <w:t>Figure 20: As sam – reading danny's folder works, creating a file is denied</w:t>
       </w:r>
     </w:p>
     <w:p>
@@ -2147,7 +2319,7 @@
         <w:drawing>
           <wp:inline xmlns:a="http://schemas.openxmlformats.org/drawingml/2006/main" xmlns:pic="http://schemas.openxmlformats.org/drawingml/2006/picture">
             <wp:extent cx="5760000" cy="3826154"/>
-            <wp:docPr id="19" name="Picture 19"/>
+            <wp:docPr id="22" name="Picture 22"/>
             <wp:cNvGraphicFramePr>
               <a:graphicFrameLocks noChangeAspect="1"/>
             </wp:cNvGraphicFramePr>
@@ -2159,7 +2331,7 @@
                     <pic:cNvPicPr/>
                   </pic:nvPicPr>
                   <pic:blipFill>
-                    <a:blip r:embed="rId29"/>
+                    <a:blip r:embed="rId32"/>
                     <a:stretch>
                       <a:fillRect/>
                     </a:stretch>
@@ -2184,7 +2356,7 @@
         <w:jc w:val="center"/>
       </w:pPr>
       <w:r>
-        <w:t>Figure 18: The C program, compiling it, and making danny the owner</w:t>
+        <w:t>Figure 21: The C program, compiling it, and making danny the owner</w:t>
       </w:r>
     </w:p>
     <w:p>
@@ -2208,7 +2380,7 @@
         <w:drawing>
           <wp:inline xmlns:a="http://schemas.openxmlformats.org/drawingml/2006/main" xmlns:pic="http://schemas.openxmlformats.org/drawingml/2006/picture">
             <wp:extent cx="5760000" cy="1458167"/>
-            <wp:docPr id="20" name="Picture 20"/>
+            <wp:docPr id="23" name="Picture 23"/>
             <wp:cNvGraphicFramePr>
               <a:graphicFrameLocks noChangeAspect="1"/>
             </wp:cNvGraphicFramePr>
@@ -2220,7 +2392,7 @@
                     <pic:cNvPicPr/>
                   </pic:nvPicPr>
                   <pic:blipFill>
-                    <a:blip r:embed="rId30"/>
+                    <a:blip r:embed="rId33"/>
                     <a:stretch>
                       <a:fillRect/>
                     </a:stretch>
@@ -2245,7 +2417,7 @@
         <w:jc w:val="center"/>
       </w:pPr>
       <w:r>
-        <w:t>Figure 19: Without SUID the program runs as sam, with SUID it runs as danny</w:t>
+        <w:t>Figure 22: Without SUID the program runs as sam, with SUID it runs as danny</w:t>
       </w:r>
     </w:p>
     <w:p>
@@ -2291,7 +2463,7 @@
         <w:drawing>
           <wp:inline xmlns:a="http://schemas.openxmlformats.org/drawingml/2006/main" xmlns:pic="http://schemas.openxmlformats.org/drawingml/2006/picture">
             <wp:extent cx="5760000" cy="369815"/>
-            <wp:docPr id="21" name="Picture 21"/>
+            <wp:docPr id="24" name="Picture 24"/>
             <wp:cNvGraphicFramePr>
               <a:graphicFrameLocks noChangeAspect="1"/>
             </wp:cNvGraphicFramePr>
@@ -2303,7 +2475,7 @@
                     <pic:cNvPicPr/>
                   </pic:nvPicPr>
                   <pic:blipFill>
-                    <a:blip r:embed="rId31"/>
+                    <a:blip r:embed="rId34"/>
                     <a:stretch>
                       <a:fillRect/>
                     </a:stretch>
@@ -2328,7 +2500,7 @@
         <w:jc w:val="center"/>
       </w:pPr>
       <w:r>
-        <w:t>Figure 20: passwd has the SUID bit and is owned by root</w:t>
+        <w:t>Figure 23: passwd has the SUID bit and is owned by root</w:t>
       </w:r>
     </w:p>
     <w:p>
@@ -2371,7 +2543,7 @@
         <w:drawing>
           <wp:inline xmlns:a="http://schemas.openxmlformats.org/drawingml/2006/main" xmlns:pic="http://schemas.openxmlformats.org/drawingml/2006/picture">
             <wp:extent cx="5760000" cy="1411579"/>
-            <wp:docPr id="22" name="Picture 22"/>
+            <wp:docPr id="25" name="Picture 25"/>
             <wp:cNvGraphicFramePr>
               <a:graphicFrameLocks noChangeAspect="1"/>
             </wp:cNvGraphicFramePr>
@@ -2383,7 +2555,7 @@
                     <pic:cNvPicPr/>
                   </pic:nvPicPr>
                   <pic:blipFill>
-                    <a:blip r:embed="rId32"/>
+                    <a:blip r:embed="rId35"/>
                     <a:stretch>
                       <a:fillRect/>
                     </a:stretch>
@@ -2408,7 +2580,7 @@
         <w:jc w:val="center"/>
       </w:pPr>
       <w:r>
-        <w:t>Figure 21: SGID test – group of files created before and after g+s</w:t>
+        <w:t>Figure 24: SGID test – group of files created before and after g+s</w:t>
       </w:r>
     </w:p>
     <w:p>
@@ -2421,7 +2593,7 @@
         <w:drawing>
           <wp:inline xmlns:a="http://schemas.openxmlformats.org/drawingml/2006/main" xmlns:pic="http://schemas.openxmlformats.org/drawingml/2006/picture">
             <wp:extent cx="5760000" cy="603871"/>
-            <wp:docPr id="23" name="Picture 23"/>
+            <wp:docPr id="26" name="Picture 26"/>
             <wp:cNvGraphicFramePr>
               <a:graphicFrameLocks noChangeAspect="1"/>
             </wp:cNvGraphicFramePr>
@@ -2433,7 +2605,7 @@
                     <pic:cNvPicPr/>
                   </pic:nvPicPr>
                   <pic:blipFill>
-                    <a:blip r:embed="rId33"/>
+                    <a:blip r:embed="rId36"/>
                     <a:stretch>
                       <a:fillRect/>
                     </a:stretch>
@@ -2458,7 +2630,7 @@
         <w:jc w:val="center"/>
       </w:pPr>
       <w:r>
-        <w:t>Figure 22: The shared directory with the SGID bit (drwxrwsr-x)</w:t>
+        <w:t>Figure 25: The shared directory with the SGID bit (drwxrwsr-x)</w:t>
       </w:r>
     </w:p>
     <w:p>
@@ -2501,7 +2673,7 @@
         <w:drawing>
           <wp:inline xmlns:a="http://schemas.openxmlformats.org/drawingml/2006/main" xmlns:pic="http://schemas.openxmlformats.org/drawingml/2006/picture">
             <wp:extent cx="5760000" cy="828983"/>
-            <wp:docPr id="24" name="Picture 24"/>
+            <wp:docPr id="27" name="Picture 27"/>
             <wp:cNvGraphicFramePr>
               <a:graphicFrameLocks noChangeAspect="1"/>
             </wp:cNvGraphicFramePr>
@@ -2513,7 +2685,7 @@
                     <pic:cNvPicPr/>
                   </pic:nvPicPr>
                   <pic:blipFill>
-                    <a:blip r:embed="rId34"/>
+                    <a:blip r:embed="rId37"/>
                     <a:stretch>
                       <a:fillRect/>
                     </a:stretch>
@@ -2538,7 +2710,7 @@
         <w:jc w:val="center"/>
       </w:pPr>
       <w:r>
-        <w:t>Figure 23: Creating the test directory with mode 777 and a file owned by sam</w:t>
+        <w:t>Figure 26: Creating the test directory with mode 777 and a file owned by sam</w:t>
       </w:r>
     </w:p>
     <w:p>
@@ -2562,7 +2734,7 @@
         <w:drawing>
           <wp:inline xmlns:a="http://schemas.openxmlformats.org/drawingml/2006/main" xmlns:pic="http://schemas.openxmlformats.org/drawingml/2006/picture">
             <wp:extent cx="5760000" cy="2505789"/>
-            <wp:docPr id="25" name="Picture 25"/>
+            <wp:docPr id="28" name="Picture 28"/>
             <wp:cNvGraphicFramePr>
               <a:graphicFrameLocks noChangeAspect="1"/>
             </wp:cNvGraphicFramePr>
@@ -2574,7 +2746,7 @@
                     <pic:cNvPicPr/>
                   </pic:nvPicPr>
                   <pic:blipFill>
-                    <a:blip r:embed="rId35"/>
+                    <a:blip r:embed="rId38"/>
                     <a:stretch>
                       <a:fillRect/>
                     </a:stretch>
@@ -2599,7 +2771,7 @@
         <w:jc w:val="center"/>
       </w:pPr>
       <w:r>
-        <w:t>Figure 24: Sticky bit test</w:t>
+        <w:t>Figure 27: Sticky bit test</w:t>
       </w:r>
     </w:p>
     <w:p>
@@ -2656,7 +2828,7 @@
         <w:drawing>
           <wp:inline xmlns:a="http://schemas.openxmlformats.org/drawingml/2006/main" xmlns:pic="http://schemas.openxmlformats.org/drawingml/2006/picture">
             <wp:extent cx="5760000" cy="1476923"/>
-            <wp:docPr id="26" name="Picture 26"/>
+            <wp:docPr id="29" name="Picture 29"/>
             <wp:cNvGraphicFramePr>
               <a:graphicFrameLocks noChangeAspect="1"/>
             </wp:cNvGraphicFramePr>
@@ -2668,7 +2840,7 @@
                     <pic:cNvPicPr/>
                   </pic:nvPicPr>
                   <pic:blipFill>
-                    <a:blip r:embed="rId36"/>
+                    <a:blip r:embed="rId39"/>
                     <a:stretch>
                       <a:fillRect/>
                     </a:stretch>
@@ -2693,7 +2865,7 @@
         <w:jc w:val="center"/>
       </w:pPr>
       <w:r>
-        <w:t>Figure 25: First attempt – rm asked for confirmation, and root deleted danny's file with the sticky bit set</w:t>
+        <w:t>Figure 28: First attempt – rm asked for confirmation, and root deleted danny's file with the sticky bit set</w:t>
       </w:r>
     </w:p>
     <w:p>

</xml_diff>

<commit_message>
Replace cut Part 4 figure with full before/after chmod 705
Co-Authored-By: Claude Opus 5.5 <noreply@anthropic.com>
Claude-Session: https://claude.ai/code/session_015FzNpWvVcgtCUNTKwZzDr2
</commit_message>
<xml_diff>
--- a/lab3_report/ITE408_Lab3_Report_1093911.docx
+++ b/lab3_report/ITE408_Lab3_Report_1093911.docx
@@ -2097,7 +2097,7 @@
       <w:r>
         <w:drawing>
           <wp:inline xmlns:a="http://schemas.openxmlformats.org/drawingml/2006/main" xmlns:pic="http://schemas.openxmlformats.org/drawingml/2006/picture">
-            <wp:extent cx="5760000" cy="3051331"/>
+            <wp:extent cx="5760000" cy="3223751"/>
             <wp:docPr id="19" name="Picture 19"/>
             <wp:cNvGraphicFramePr>
               <a:graphicFrameLocks noChangeAspect="1"/>
@@ -2106,7 +2106,7 @@
               <a:graphicData uri="http://schemas.openxmlformats.org/drawingml/2006/picture">
                 <pic:pic>
                   <pic:nvPicPr>
-                    <pic:cNvPr id="0" name="a48.png"/>
+                    <pic:cNvPr id="0" name="c60_705.png"/>
                     <pic:cNvPicPr/>
                   </pic:nvPicPr>
                   <pic:blipFill>
@@ -2118,7 +2118,7 @@
                   <pic:spPr>
                     <a:xfrm>
                       <a:off x="0" y="0"/>
-                      <a:ext cx="5760000" cy="3051331"/>
+                      <a:ext cx="5760000" cy="3223751"/>
                     </a:xfrm>
                     <a:prstGeom prst="rect"/>
                   </pic:spPr>
@@ -2135,7 +2135,7 @@
         <w:jc w:val="center"/>
       </w:pPr>
       <w:r>
-        <w:t>Figure 18: As danny – chmod 705 and creating test.txt</w:t>
+        <w:t>Figure 18: As danny – top: before and after chmod 705 (05:41–05:42); bottom: creating test.txt in the 705 directory (earlier run at 05:39)</w:t>
       </w:r>
     </w:p>
     <w:p>

</xml_diff>

<commit_message>
Keep Lab 3 tables on one page; final Part A report
Co-Authored-By: Claude Opus 5.5 <noreply@anthropic.com>
Claude-Session: https://claude.ai/code/session_015FzNpWvVcgtCUNTKwZzDr2
</commit_message>
<xml_diff>
--- a/lab3_report/ITE408_Lab3_Report_1093911.docx
+++ b/lab3_report/ITE408_Lab3_Report_1093911.docx
@@ -1767,6 +1767,7 @@
           </w:tcPr>
           <w:p>
             <w:pPr>
+              <w:keepNext/>
               <w:spacing w:after="0"/>
             </w:pPr>
             <w:r>
@@ -1790,6 +1791,7 @@
           </w:tcPr>
           <w:p>
             <w:pPr>
+              <w:keepNext/>
               <w:spacing w:after="0"/>
             </w:pPr>
             <w:r>
@@ -1813,6 +1815,7 @@
           </w:tcPr>
           <w:p>
             <w:pPr>
+              <w:keepNext/>
               <w:spacing w:after="0"/>
             </w:pPr>
             <w:r>
@@ -1836,6 +1839,7 @@
           </w:tcPr>
           <w:p>
             <w:pPr>
+              <w:keepNext/>
               <w:spacing w:after="0"/>
             </w:pPr>
             <w:r>
@@ -1860,6 +1864,7 @@
           </w:tcPr>
           <w:p>
             <w:pPr>
+              <w:keepNext/>
               <w:spacing w:after="0"/>
             </w:pPr>
             <w:r/>
@@ -1878,6 +1883,7 @@
           </w:tcPr>
           <w:p>
             <w:pPr>
+              <w:keepNext/>
               <w:spacing w:after="0"/>
             </w:pPr>
             <w:r/>
@@ -1896,6 +1902,7 @@
           </w:tcPr>
           <w:p>
             <w:pPr>
+              <w:keepNext/>
               <w:spacing w:after="0"/>
             </w:pPr>
             <w:r/>
@@ -1914,6 +1921,7 @@
           </w:tcPr>
           <w:p>
             <w:pPr>
+              <w:keepNext/>
               <w:spacing w:after="0"/>
             </w:pPr>
             <w:r/>
@@ -1934,6 +1942,7 @@
           </w:tcPr>
           <w:p>
             <w:pPr>
+              <w:keepNext/>
               <w:spacing w:after="0"/>
             </w:pPr>
             <w:r/>
@@ -1952,6 +1961,7 @@
           </w:tcPr>
           <w:p>
             <w:pPr>
+              <w:keepNext/>
               <w:spacing w:after="0"/>
             </w:pPr>
             <w:r/>
@@ -1970,6 +1980,7 @@
           </w:tcPr>
           <w:p>
             <w:pPr>
+              <w:keepNext/>
               <w:spacing w:after="0"/>
             </w:pPr>
             <w:r/>
@@ -1988,6 +1999,7 @@
           </w:tcPr>
           <w:p>
             <w:pPr>
+              <w:keepNext/>
               <w:spacing w:after="0"/>
             </w:pPr>
             <w:r/>
@@ -2008,6 +2020,7 @@
           </w:tcPr>
           <w:p>
             <w:pPr>
+              <w:keepNext/>
               <w:spacing w:after="0"/>
             </w:pPr>
             <w:r/>
@@ -2026,6 +2039,7 @@
           </w:tcPr>
           <w:p>
             <w:pPr>
+              <w:keepNext/>
               <w:spacing w:after="0"/>
             </w:pPr>
             <w:r/>
@@ -2044,6 +2058,7 @@
           </w:tcPr>
           <w:p>
             <w:pPr>
+              <w:keepNext/>
               <w:spacing w:after="0"/>
             </w:pPr>
             <w:r/>
@@ -2062,6 +2077,7 @@
           </w:tcPr>
           <w:p>
             <w:pPr>
+              <w:keepNext/>
               <w:spacing w:after="0"/>
             </w:pPr>
             <w:r/>
@@ -2897,6 +2913,7 @@
           </w:tcPr>
           <w:p>
             <w:pPr>
+              <w:keepNext/>
               <w:spacing w:after="0"/>
             </w:pPr>
             <w:r>
@@ -2920,6 +2937,7 @@
           </w:tcPr>
           <w:p>
             <w:pPr>
+              <w:keepNext/>
               <w:spacing w:after="0"/>
             </w:pPr>
             <w:r>
@@ -2943,6 +2961,7 @@
           </w:tcPr>
           <w:p>
             <w:pPr>
+              <w:keepNext/>
               <w:spacing w:after="0"/>
             </w:pPr>
             <w:r>
@@ -2966,6 +2985,7 @@
           </w:tcPr>
           <w:p>
             <w:pPr>
+              <w:keepNext/>
               <w:spacing w:after="0"/>
             </w:pPr>
             <w:r>
@@ -2990,6 +3010,7 @@
           </w:tcPr>
           <w:p>
             <w:pPr>
+              <w:keepNext/>
               <w:spacing w:after="0"/>
             </w:pPr>
             <w:r/>
@@ -3008,6 +3029,7 @@
           </w:tcPr>
           <w:p>
             <w:pPr>
+              <w:keepNext/>
               <w:spacing w:after="0"/>
             </w:pPr>
             <w:r/>
@@ -3026,6 +3048,7 @@
           </w:tcPr>
           <w:p>
             <w:pPr>
+              <w:keepNext/>
               <w:spacing w:after="0"/>
             </w:pPr>
             <w:r/>
@@ -3044,6 +3067,7 @@
           </w:tcPr>
           <w:p>
             <w:pPr>
+              <w:keepNext/>
               <w:spacing w:after="0"/>
             </w:pPr>
             <w:r/>
@@ -3064,6 +3088,7 @@
           </w:tcPr>
           <w:p>
             <w:pPr>
+              <w:keepNext/>
               <w:spacing w:after="0"/>
             </w:pPr>
             <w:r/>
@@ -3082,6 +3107,7 @@
           </w:tcPr>
           <w:p>
             <w:pPr>
+              <w:keepNext/>
               <w:spacing w:after="0"/>
             </w:pPr>
             <w:r/>
@@ -3100,6 +3126,7 @@
           </w:tcPr>
           <w:p>
             <w:pPr>
+              <w:keepNext/>
               <w:spacing w:after="0"/>
             </w:pPr>
             <w:r/>
@@ -3118,6 +3145,7 @@
           </w:tcPr>
           <w:p>
             <w:pPr>
+              <w:keepNext/>
               <w:spacing w:after="0"/>
             </w:pPr>
             <w:r/>
@@ -3138,6 +3166,7 @@
           </w:tcPr>
           <w:p>
             <w:pPr>
+              <w:keepNext/>
               <w:spacing w:after="0"/>
             </w:pPr>
             <w:r/>
@@ -3156,6 +3185,7 @@
           </w:tcPr>
           <w:p>
             <w:pPr>
+              <w:keepNext/>
               <w:spacing w:after="0"/>
             </w:pPr>
             <w:r/>
@@ -3174,6 +3204,7 @@
           </w:tcPr>
           <w:p>
             <w:pPr>
+              <w:keepNext/>
               <w:spacing w:after="0"/>
             </w:pPr>
             <w:r/>
@@ -3192,6 +3223,7 @@
           </w:tcPr>
           <w:p>
             <w:pPr>
+              <w:keepNext/>
               <w:spacing w:after="0"/>
             </w:pPr>
             <w:r/>

</xml_diff>